<commit_message>
Integrated postgres to save an issue when the user fills out the form
</commit_message>
<xml_diff>
--- a/Deliverable.docx
+++ b/Deliverable.docx
@@ -431,15 +431,7 @@
           <w:szCs w:val="40"/>
           <w:lang w:val="en-US"/>
         </w:rPr>
-        <w:t xml:space="preserve">Name: </w:t>
-      </w:r>
-      <w:r>
-        <w:rPr>
-          <w:sz w:val="40"/>
-          <w:szCs w:val="40"/>
-          <w:lang w:val="en-US"/>
-        </w:rPr>
-        <w:t>Pintea Filip Ioan</w:t>
+        <w:t>Name: Pintea Filip Ioan</w:t>
       </w:r>
     </w:p>
     <w:p>
@@ -459,15 +451,7 @@
           <w:szCs w:val="40"/>
           <w:lang w:val="en-US"/>
         </w:rPr>
-        <w:t xml:space="preserve">Group: </w:t>
-      </w:r>
-      <w:r>
-        <w:rPr>
-          <w:sz w:val="40"/>
-          <w:szCs w:val="40"/>
-          <w:lang w:val="en-US"/>
-        </w:rPr>
-        <w:t>30435</w:t>
+        <w:t>Group: 30435</w:t>
       </w:r>
     </w:p>
     <w:p>
@@ -3060,6 +3044,12 @@
       <w:bookmarkStart w:id="30" w:name="_Toc193372757"/>
       <w:bookmarkEnd w:id="30"/>
       <w:r>
+        <w:rPr>
+          <w:lang w:val="en-US"/>
+        </w:rPr>
+        <w:t>UML Use C</w:t>
+      </w:r>
+      <w:r>
         <w:drawing>
           <wp:anchor distT="0" distB="0" distL="0" distR="0" simplePos="0" relativeHeight="4" behindDoc="0" locked="0" layoutInCell="0" allowOverlap="1">
             <wp:simplePos x="0" y="0"/>
@@ -3069,7 +3059,7 @@
             <wp:positionV relativeFrom="paragraph">
               <wp:posOffset>635</wp:posOffset>
             </wp:positionV>
-            <wp:extent cx="4331970" cy="4018280"/>
+            <wp:extent cx="4735195" cy="4728845"/>
             <wp:effectExtent l="0" t="0" r="0" b="0"/>
             <wp:wrapSquare wrapText="largest"/>
             <wp:docPr id="2" name="Image1"/>
@@ -3094,7 +3084,7 @@
                   <pic:spPr bwMode="auto">
                     <a:xfrm>
                       <a:off x="0" y="0"/>
-                      <a:ext cx="4331970" cy="4018280"/>
+                      <a:ext cx="4735195" cy="4728845"/>
                     </a:xfrm>
                     <a:prstGeom prst="rect">
                       <a:avLst/>
@@ -3111,7 +3101,7 @@
         <w:rPr>
           <w:lang w:val="en-US"/>
         </w:rPr>
-        <w:t>UML Use Case Diagrams</w:t>
+        <w:t xml:space="preserve">ase </w:t>
       </w:r>
     </w:p>
     <w:p>
@@ -3548,79 +3538,48 @@
         <w:jc w:val="start"/>
         <w:rPr/>
       </w:pPr>
-      <w:bookmarkStart w:id="39" w:name="p-rc_2efaeed1f8bbf29a-227"/>
+      <w:bookmarkStart w:id="39" w:name="p-rc_2efaeed1f8bbf29a-228"/>
       <w:bookmarkEnd w:id="39"/>
       <w:r>
         <w:rPr>
           <w:b/>
           <w:bCs/>
         </w:rPr>
-        <w:t>Data Persistence</w:t>
-      </w:r>
-      <w:r>
-        <w:rPr/>
-        <w:t>: The application is constrained to use the H2 in-memory SQL database for local development and testing, interfaced via Spring Data JPA and Hibernate for Object-Relational Mapping (ORM).</w:t>
-      </w:r>
-    </w:p>
-    <w:p>
-      <w:pPr>
-        <w:pStyle w:val="BodyText"/>
-        <w:widowControl/>
-        <w:numPr>
-          <w:ilvl w:val="0"/>
-          <w:numId w:val="13"/>
-        </w:numPr>
-        <w:tabs>
-          <w:tab w:val="clear" w:pos="720"/>
-          <w:tab w:val="left" w:pos="0" w:leader="none"/>
-        </w:tabs>
-        <w:bidi w:val="0"/>
-        <w:ind w:hanging="283" w:start="720" w:end="0"/>
-        <w:jc w:val="start"/>
-        <w:rPr/>
-      </w:pPr>
-      <w:bookmarkStart w:id="40" w:name="p-rc_2efaeed1f8bbf29a-228"/>
+        <w:t>Communication Protocol</w:t>
+      </w:r>
+      <w:r>
+        <w:rPr/>
+        <w:t>: The frontend and backend must communicate strictly via HTTP requests sending and receiving JSON payloads, implemented via the Axios library.</w:t>
+      </w:r>
+    </w:p>
+    <w:p>
+      <w:pPr>
+        <w:pStyle w:val="Normal"/>
+        <w:rPr>
+          <w:lang w:val="en-US"/>
+        </w:rPr>
+      </w:pPr>
+      <w:r>
+        <w:rPr>
+          <w:lang w:val="en-US"/>
+        </w:rPr>
+      </w:r>
+    </w:p>
+    <w:p>
+      <w:pPr>
+        <w:pStyle w:val="Heading2"/>
+        <w:rPr>
+          <w:lang w:val="en-US"/>
+        </w:rPr>
+      </w:pPr>
+      <w:bookmarkStart w:id="40" w:name="_Toc193372761"/>
+      <w:r>
+        <w:rPr>
+          <w:lang w:val="en-US"/>
+        </w:rPr>
+        <w:t>Glossary</w:t>
+      </w:r>
       <w:bookmarkEnd w:id="40"/>
-      <w:r>
-        <w:rPr>
-          <w:b/>
-          <w:bCs/>
-        </w:rPr>
-        <w:t>Communication Protocol</w:t>
-      </w:r>
-      <w:r>
-        <w:rPr/>
-        <w:t>: The frontend and backend must communicate strictly via HTTP requests sending and receiving JSON payloads, implemented via the Axios library.</w:t>
-      </w:r>
-    </w:p>
-    <w:p>
-      <w:pPr>
-        <w:pStyle w:val="Normal"/>
-        <w:rPr>
-          <w:lang w:val="en-US"/>
-        </w:rPr>
-      </w:pPr>
-      <w:r>
-        <w:rPr>
-          <w:lang w:val="en-US"/>
-        </w:rPr>
-      </w:r>
-    </w:p>
-    <w:p>
-      <w:pPr>
-        <w:pStyle w:val="Heading2"/>
-        <w:rPr>
-          <w:lang w:val="en-US"/>
-        </w:rPr>
-      </w:pPr>
-      <w:bookmarkStart w:id="41" w:name="_Toc193372761"/>
-      <w:r>
-        <w:rPr>
-          <w:lang w:val="en-US"/>
-        </w:rPr>
-        <w:t>Glossary</w:t>
-      </w:r>
-      <w:bookmarkEnd w:id="41"/>
     </w:p>
     <w:p>
       <w:pPr>
@@ -3636,8 +3595,8 @@
         <w:ind w:hanging="283" w:start="720" w:end="0"/>
         <w:rPr/>
       </w:pPr>
-      <w:bookmarkStart w:id="42" w:name="p-rc_2efaeed1f8bbf29a-230"/>
-      <w:bookmarkEnd w:id="42"/>
+      <w:bookmarkStart w:id="41" w:name="p-rc_2efaeed1f8bbf29a-230"/>
+      <w:bookmarkEnd w:id="41"/>
       <w:r>
         <w:rPr>
           <w:b/>
@@ -3663,8 +3622,8 @@
         <w:ind w:hanging="283" w:start="720" w:end="0"/>
         <w:rPr/>
       </w:pPr>
-      <w:bookmarkStart w:id="43" w:name="p-rc_2efaeed1f8bbf29a-231"/>
-      <w:bookmarkEnd w:id="43"/>
+      <w:bookmarkStart w:id="42" w:name="p-rc_2efaeed1f8bbf29a-231"/>
+      <w:bookmarkEnd w:id="42"/>
       <w:r>
         <w:rPr>
           <w:b/>
@@ -3690,8 +3649,8 @@
         <w:ind w:hanging="283" w:start="720" w:end="0"/>
         <w:rPr/>
       </w:pPr>
-      <w:bookmarkStart w:id="44" w:name="p-rc_2efaeed1f8bbf29a-232"/>
-      <w:bookmarkEnd w:id="44"/>
+      <w:bookmarkStart w:id="43" w:name="p-rc_2efaeed1f8bbf29a-232"/>
+      <w:bookmarkEnd w:id="43"/>
       <w:r>
         <w:rPr>
           <w:b/>
@@ -3717,8 +3676,8 @@
         <w:ind w:hanging="283" w:start="720" w:end="0"/>
         <w:rPr/>
       </w:pPr>
-      <w:bookmarkStart w:id="45" w:name="p-rc_2efaeed1f8bbf29a-233"/>
-      <w:bookmarkEnd w:id="45"/>
+      <w:bookmarkStart w:id="44" w:name="p-rc_2efaeed1f8bbf29a-233"/>
+      <w:bookmarkEnd w:id="44"/>
       <w:r>
         <w:rPr>
           <w:b/>
@@ -3744,8 +3703,8 @@
         <w:ind w:hanging="283" w:start="720" w:end="0"/>
         <w:rPr/>
       </w:pPr>
-      <w:bookmarkStart w:id="46" w:name="p-rc_2efaeed1f8bbf29a-234"/>
-      <w:bookmarkEnd w:id="46"/>
+      <w:bookmarkStart w:id="45" w:name="p-rc_2efaeed1f8bbf29a-234"/>
+      <w:bookmarkEnd w:id="45"/>
       <w:r>
         <w:rPr>
           <w:b/>
@@ -3771,8 +3730,8 @@
         <w:ind w:hanging="283" w:start="720" w:end="0"/>
         <w:rPr/>
       </w:pPr>
-      <w:bookmarkStart w:id="47" w:name="p-rc_2efaeed1f8bbf29a-235"/>
-      <w:bookmarkEnd w:id="47"/>
+      <w:bookmarkStart w:id="46" w:name="p-rc_2efaeed1f8bbf29a-235"/>
+      <w:bookmarkEnd w:id="46"/>
       <w:r>
         <w:rPr>
           <w:b/>
@@ -3798,36 +3757,230 @@
         <w:ind w:hanging="283" w:start="720" w:end="0"/>
         <w:rPr/>
       </w:pPr>
-      <w:bookmarkStart w:id="48" w:name="p-rc_2efaeed1f8bbf29a-236"/>
+      <w:bookmarkStart w:id="47" w:name="p-rc_2efaeed1f8bbf29a-236"/>
+      <w:bookmarkEnd w:id="47"/>
+      <w:r>
+        <w:rPr>
+          <w:b/>
+        </w:rPr>
+        <w:t>Composite Assignment Strategy:</w:t>
+      </w:r>
+      <w:r>
+        <w:rPr/>
+        <w:t xml:space="preserve"> A design approach where multiple rules (e.g., shortest distance </w:t>
+      </w:r>
+      <w:r>
+        <w:rPr>
+          <w:i/>
+        </w:rPr>
+        <w:t>plus</w:t>
+      </w:r>
+      <w:r>
+        <w:rPr/>
+        <w:t xml:space="preserve"> lowest workload) are combined to determine the final task assignment.</w:t>
+      </w:r>
+    </w:p>
+    <w:p>
+      <w:pPr>
+        <w:pStyle w:val="BodyText"/>
+        <w:rPr/>
+      </w:pPr>
+      <w:r>
+        <w:rPr/>
+      </w:r>
+    </w:p>
+    <w:p>
+      <w:pPr>
+        <w:pStyle w:val="Heading1"/>
+        <w:rPr>
+          <w:lang w:val="en-US"/>
+        </w:rPr>
+      </w:pPr>
+      <w:bookmarkStart w:id="48" w:name="_Toc193372762"/>
+      <w:r>
+        <w:rPr>
+          <w:lang w:val="en-US"/>
+        </w:rPr>
+        <w:t>Deliverable 2</w:t>
+      </w:r>
       <w:bookmarkEnd w:id="48"/>
-      <w:r>
-        <w:rPr>
-          <w:b/>
-        </w:rPr>
-        <w:t>Composite Assignment Strategy:</w:t>
-      </w:r>
-      <w:r>
-        <w:rPr/>
-        <w:t xml:space="preserve"> A design approach where multiple rules (e.g., shortest distance </w:t>
-      </w:r>
-      <w:r>
-        <w:rPr>
-          <w:i/>
-        </w:rPr>
-        <w:t>plus</w:t>
-      </w:r>
-      <w:r>
-        <w:rPr/>
-        <w:t xml:space="preserve"> lowest workload) are combined to determine the final task assignment.</w:t>
+    </w:p>
+    <w:p>
+      <w:pPr>
+        <w:pStyle w:val="Heading2"/>
+        <w:rPr>
+          <w:lang w:val="en-US"/>
+        </w:rPr>
+      </w:pPr>
+      <w:bookmarkStart w:id="49" w:name="_Toc193372763"/>
+      <w:r>
+        <w:rPr>
+          <w:lang w:val="en-US"/>
+        </w:rPr>
+        <w:t>Domain Model</w:t>
+      </w:r>
+      <w:bookmarkEnd w:id="49"/>
+    </w:p>
+    <w:p>
+      <w:pPr>
+        <w:pStyle w:val="InfoBlue"/>
+        <w:rPr/>
+      </w:pPr>
+      <w:r>
+        <w:rPr/>
+        <w:t>[Define the domain model and create the conceptual class diagrams]</w:t>
+      </w:r>
+    </w:p>
+    <w:p>
+      <w:pPr>
+        <w:pStyle w:val="Normal"/>
+        <w:rPr>
+          <w:lang w:val="en-US"/>
+        </w:rPr>
+      </w:pPr>
+      <w:r>
+        <w:rPr>
+          <w:lang w:val="en-US"/>
+        </w:rPr>
+      </w:r>
+    </w:p>
+    <w:p>
+      <w:pPr>
+        <w:pStyle w:val="Heading2"/>
+        <w:rPr>
+          <w:lang w:val="en-US"/>
+        </w:rPr>
+      </w:pPr>
+      <w:bookmarkStart w:id="50" w:name="_Toc193372764"/>
+      <w:r>
+        <w:rPr>
+          <w:lang w:val="en-US"/>
+        </w:rPr>
+        <w:t>Architectural Design</w:t>
+      </w:r>
+      <w:bookmarkEnd w:id="50"/>
+    </w:p>
+    <w:p>
+      <w:pPr>
+        <w:pStyle w:val="Heading3"/>
+        <w:rPr>
+          <w:lang w:val="en-US"/>
+        </w:rPr>
+      </w:pPr>
+      <w:bookmarkStart w:id="51" w:name="_Toc193372765"/>
+      <w:r>
+        <w:rPr>
+          <w:lang w:val="en-US"/>
+        </w:rPr>
+        <w:t>Conceptual Architecture</w:t>
+      </w:r>
+      <w:bookmarkEnd w:id="51"/>
+    </w:p>
+    <w:p>
+      <w:pPr>
+        <w:pStyle w:val="InfoBlue"/>
+        <w:rPr/>
+      </w:pPr>
+      <w:r>
+        <w:rPr/>
+        <w:t>[Define the system’s conceptual architecture; use an architectural style and pattern - highlight its use and motivate your choice.]</w:t>
       </w:r>
     </w:p>
     <w:p>
       <w:pPr>
         <w:pStyle w:val="BodyText"/>
-        <w:rPr/>
-      </w:pPr>
-      <w:r>
-        <w:rPr/>
+        <w:rPr>
+          <w:lang w:val="en-US"/>
+        </w:rPr>
+      </w:pPr>
+      <w:r>
+        <w:rPr>
+          <w:lang w:val="en-US"/>
+        </w:rPr>
+      </w:r>
+    </w:p>
+    <w:p>
+      <w:pPr>
+        <w:pStyle w:val="Heading3"/>
+        <w:rPr>
+          <w:lang w:val="en-US"/>
+        </w:rPr>
+      </w:pPr>
+      <w:bookmarkStart w:id="52" w:name="_Toc193372766"/>
+      <w:r>
+        <w:rPr>
+          <w:lang w:val="en-US"/>
+        </w:rPr>
+        <w:t>Package Design</w:t>
+      </w:r>
+      <w:bookmarkEnd w:id="52"/>
+      <w:r>
+        <w:rPr>
+          <w:lang w:val="en-US"/>
+        </w:rPr>
+        <w:t xml:space="preserve"> </w:t>
+      </w:r>
+    </w:p>
+    <w:p>
+      <w:pPr>
+        <w:pStyle w:val="InfoBlue"/>
+        <w:rPr/>
+      </w:pPr>
+      <w:r>
+        <w:rPr/>
+        <w:t>[Create a package diagram]</w:t>
+      </w:r>
+    </w:p>
+    <w:p>
+      <w:pPr>
+        <w:pStyle w:val="BodyText"/>
+        <w:rPr>
+          <w:lang w:val="en-US"/>
+        </w:rPr>
+      </w:pPr>
+      <w:r>
+        <w:rPr>
+          <w:lang w:val="en-US"/>
+        </w:rPr>
+      </w:r>
+    </w:p>
+    <w:p>
+      <w:pPr>
+        <w:pStyle w:val="Heading3"/>
+        <w:rPr>
+          <w:lang w:val="en-US"/>
+        </w:rPr>
+      </w:pPr>
+      <w:bookmarkStart w:id="53" w:name="_Toc193372767"/>
+      <w:r>
+        <w:rPr>
+          <w:lang w:val="en-US"/>
+        </w:rPr>
+        <w:t>Component and Deployment Diagram</w:t>
+      </w:r>
+      <w:bookmarkEnd w:id="53"/>
+    </w:p>
+    <w:p>
+      <w:pPr>
+        <w:pStyle w:val="InfoBlue"/>
+        <w:rPr/>
+      </w:pPr>
+      <w:r>
+        <w:rPr/>
+        <w:t>[Create the component and deployment diagrams.]</w:t>
+      </w:r>
+    </w:p>
+    <w:p>
+      <w:pPr>
+        <w:pStyle w:val="Normal"/>
+        <w:rPr>
+          <w:lang w:val="en-US"/>
+        </w:rPr>
+      </w:pPr>
+      <w:r>
+        <w:rPr>
+          <w:lang w:val="en-US"/>
+        </w:rPr>
       </w:r>
     </w:p>
     <w:p>
@@ -3837,14 +3990,14 @@
           <w:lang w:val="en-US"/>
         </w:rPr>
       </w:pPr>
-      <w:bookmarkStart w:id="49" w:name="_Toc193372762"/>
-      <w:r>
-        <w:rPr>
-          <w:lang w:val="en-US"/>
-        </w:rPr>
-        <w:t>Deliverable 2</w:t>
-      </w:r>
-      <w:bookmarkEnd w:id="49"/>
+      <w:bookmarkStart w:id="54" w:name="_Toc193372768"/>
+      <w:r>
+        <w:rPr>
+          <w:lang w:val="en-US"/>
+        </w:rPr>
+        <w:t>Deliverable 3</w:t>
+      </w:r>
+      <w:bookmarkEnd w:id="54"/>
     </w:p>
     <w:p>
       <w:pPr>
@@ -3853,23 +4006,41 @@
           <w:lang w:val="en-US"/>
         </w:rPr>
       </w:pPr>
-      <w:bookmarkStart w:id="50" w:name="_Toc193372763"/>
-      <w:r>
-        <w:rPr>
-          <w:lang w:val="en-US"/>
-        </w:rPr>
-        <w:t>Domain Model</w:t>
-      </w:r>
-      <w:bookmarkEnd w:id="50"/>
+      <w:bookmarkStart w:id="55" w:name="_Toc193372769"/>
+      <w:r>
+        <w:rPr>
+          <w:lang w:val="en-US"/>
+        </w:rPr>
+        <w:t>Design Model</w:t>
+      </w:r>
+      <w:bookmarkEnd w:id="55"/>
+    </w:p>
+    <w:p>
+      <w:pPr>
+        <w:pStyle w:val="Heading3"/>
+        <w:rPr>
+          <w:lang w:val="en-US"/>
+        </w:rPr>
+      </w:pPr>
+      <w:bookmarkStart w:id="56" w:name="_Toc193372770"/>
+      <w:r>
+        <w:rPr>
+          <w:lang w:val="en-US"/>
+        </w:rPr>
+        <w:t>Dynamic Behavior</w:t>
+      </w:r>
+      <w:bookmarkEnd w:id="56"/>
     </w:p>
     <w:p>
       <w:pPr>
         <w:pStyle w:val="InfoBlue"/>
-        <w:rPr/>
-      </w:pPr>
-      <w:r>
-        <w:rPr/>
-        <w:t>[Define the domain model and create the conceptual class diagrams]</w:t>
+        <w:rPr>
+          <w:i w:val="false"/>
+        </w:rPr>
+      </w:pPr>
+      <w:r>
+        <w:rPr/>
+        <w:t>[Create the interaction diagrams (2 sequence) for 2 relevant scenarios]</w:t>
       </w:r>
     </w:p>
     <w:p>
@@ -3887,35 +4058,60 @@
     </w:p>
     <w:p>
       <w:pPr>
+        <w:pStyle w:val="Heading3"/>
+        <w:rPr>
+          <w:lang w:val="en-US"/>
+        </w:rPr>
+      </w:pPr>
+      <w:bookmarkStart w:id="57" w:name="_Toc193372771"/>
+      <w:r>
+        <w:rPr>
+          <w:lang w:val="en-US"/>
+        </w:rPr>
+        <w:t>Class Diagram</w:t>
+      </w:r>
+      <w:bookmarkEnd w:id="57"/>
+    </w:p>
+    <w:p>
+      <w:pPr>
+        <w:pStyle w:val="InfoBlue"/>
+        <w:rPr>
+          <w:i w:val="false"/>
+        </w:rPr>
+      </w:pPr>
+      <w:r>
+        <w:rPr/>
+        <w:t>[Create the UML class diagram; apply GoF patterns and motivate your choice]</w:t>
+      </w:r>
+    </w:p>
+    <w:p>
+      <w:pPr>
+        <w:pStyle w:val="Normal"/>
+        <w:rPr>
+          <w:lang w:val="en-US"/>
+        </w:rPr>
+      </w:pPr>
+      <w:r>
+        <w:rPr>
+          <w:lang w:val="en-US"/>
+        </w:rPr>
+      </w:r>
+    </w:p>
+    <w:p>
+      <w:pPr>
         <w:pStyle w:val="Heading2"/>
         <w:rPr>
           <w:lang w:val="en-US"/>
         </w:rPr>
       </w:pPr>
-      <w:bookmarkStart w:id="51" w:name="_Toc193372764"/>
-      <w:r>
-        <w:rPr>
-          <w:lang w:val="en-US"/>
-        </w:rPr>
-        <w:t>Architectural Design</w:t>
-      </w:r>
-      <w:bookmarkEnd w:id="51"/>
-    </w:p>
-    <w:p>
-      <w:pPr>
-        <w:pStyle w:val="Heading3"/>
-        <w:rPr>
-          <w:lang w:val="en-US"/>
-        </w:rPr>
-      </w:pPr>
-      <w:bookmarkStart w:id="52" w:name="_Toc193372765"/>
-      <w:r>
-        <w:rPr>
-          <w:lang w:val="en-US"/>
-        </w:rPr>
-        <w:t>Conceptual Architecture</w:t>
-      </w:r>
-      <w:bookmarkEnd w:id="52"/>
+      <w:bookmarkStart w:id="58" w:name="_Toc193372772"/>
+      <w:r>
+        <w:rPr>
+          <w:lang w:val="en-US"/>
+        </w:rPr>
+        <w:t>Data Model</w:t>
+      </w:r>
+      <w:bookmarkEnd w:id="58"/>
     </w:p>
     <w:p>
       <w:pPr>
@@ -3924,7 +4120,7 @@
       </w:pPr>
       <w:r>
         <w:rPr/>
-        <w:t>[Define the system’s conceptual architecture; use an architectural style and pattern - highlight its use and motivate your choice.]</w:t>
+        <w:t>[Create the data model for the system.]</w:t>
       </w:r>
     </w:p>
     <w:p>
@@ -3942,25 +4138,19 @@
     </w:p>
     <w:p>
       <w:pPr>
-        <w:pStyle w:val="Heading3"/>
-        <w:rPr>
-          <w:lang w:val="en-US"/>
-        </w:rPr>
-      </w:pPr>
-      <w:bookmarkStart w:id="53" w:name="_Toc193372766"/>
-      <w:r>
-        <w:rPr>
-          <w:lang w:val="en-US"/>
-        </w:rPr>
-        <w:t>Package Design</w:t>
-      </w:r>
-      <w:bookmarkEnd w:id="53"/>
-      <w:r>
-        <w:rPr>
-          <w:lang w:val="en-US"/>
-        </w:rPr>
-        <w:t xml:space="preserve"> </w:t>
-      </w:r>
+        <w:pStyle w:val="Heading1"/>
+        <w:rPr>
+          <w:lang w:val="en-US"/>
+        </w:rPr>
+      </w:pPr>
+      <w:bookmarkStart w:id="59" w:name="_Toc193372773"/>
+      <w:r>
+        <w:rPr>
+          <w:lang w:val="en-US"/>
+        </w:rPr>
+        <w:t>System Testing</w:t>
+      </w:r>
+      <w:bookmarkEnd w:id="59"/>
     </w:p>
     <w:p>
       <w:pPr>
@@ -3969,37 +4159,37 @@
       </w:pPr>
       <w:r>
         <w:rPr/>
-        <w:t>[Create a package diagram]</w:t>
-      </w:r>
-    </w:p>
-    <w:p>
-      <w:pPr>
-        <w:pStyle w:val="BodyText"/>
-        <w:rPr>
-          <w:lang w:val="en-US"/>
-        </w:rPr>
-      </w:pPr>
-      <w:r>
-        <w:rPr>
-          <w:lang w:val="en-US"/>
-        </w:rPr>
-      </w:r>
-    </w:p>
-    <w:p>
-      <w:pPr>
-        <w:pStyle w:val="Heading3"/>
-        <w:rPr>
-          <w:lang w:val="en-US"/>
-        </w:rPr>
-      </w:pPr>
-      <w:bookmarkStart w:id="54" w:name="_Toc193372767"/>
-      <w:r>
-        <w:rPr>
-          <w:lang w:val="en-US"/>
-        </w:rPr>
-        <w:t>Component and Deployment Diagram</w:t>
-      </w:r>
-      <w:bookmarkEnd w:id="54"/>
+        <w:t>[Describe the testing methides and some test cases.]</w:t>
+      </w:r>
+    </w:p>
+    <w:p>
+      <w:pPr>
+        <w:pStyle w:val="Normal"/>
+        <w:rPr>
+          <w:lang w:val="en-US"/>
+        </w:rPr>
+      </w:pPr>
+      <w:r>
+        <w:rPr>
+          <w:lang w:val="en-US"/>
+        </w:rPr>
+      </w:r>
+    </w:p>
+    <w:p>
+      <w:pPr>
+        <w:pStyle w:val="Heading1"/>
+        <w:rPr>
+          <w:lang w:val="en-US"/>
+        </w:rPr>
+      </w:pPr>
+      <w:bookmarkStart w:id="60" w:name="_Toc193372774"/>
+      <w:r>
+        <w:rPr>
+          <w:lang w:val="en-US"/>
+        </w:rPr>
+        <w:t>Future Improvements</w:t>
+      </w:r>
+      <w:bookmarkEnd w:id="60"/>
     </w:p>
     <w:p>
       <w:pPr>
@@ -4008,7 +4198,7 @@
       </w:pPr>
       <w:r>
         <w:rPr/>
-        <w:t>[Create the component and deployment diagrams.]</w:t>
+        <w:t>[Present some features that apply to the application scope.]</w:t>
       </w:r>
     </w:p>
     <w:p>
@@ -4031,58 +4221,14 @@
           <w:lang w:val="en-US"/>
         </w:rPr>
       </w:pPr>
-      <w:bookmarkStart w:id="55" w:name="_Toc193372768"/>
-      <w:r>
-        <w:rPr>
-          <w:lang w:val="en-US"/>
-        </w:rPr>
-        <w:t>Deliverable 3</w:t>
-      </w:r>
-      <w:bookmarkEnd w:id="55"/>
-    </w:p>
-    <w:p>
-      <w:pPr>
-        <w:pStyle w:val="Heading2"/>
-        <w:rPr>
-          <w:lang w:val="en-US"/>
-        </w:rPr>
-      </w:pPr>
-      <w:bookmarkStart w:id="56" w:name="_Toc193372769"/>
-      <w:r>
-        <w:rPr>
-          <w:lang w:val="en-US"/>
-        </w:rPr>
-        <w:t>Design Model</w:t>
-      </w:r>
-      <w:bookmarkEnd w:id="56"/>
-    </w:p>
-    <w:p>
-      <w:pPr>
-        <w:pStyle w:val="Heading3"/>
-        <w:rPr>
-          <w:lang w:val="en-US"/>
-        </w:rPr>
-      </w:pPr>
-      <w:bookmarkStart w:id="57" w:name="_Toc193372770"/>
-      <w:r>
-        <w:rPr>
-          <w:lang w:val="en-US"/>
-        </w:rPr>
-        <w:t>Dynamic Behavior</w:t>
-      </w:r>
-      <w:bookmarkEnd w:id="57"/>
-    </w:p>
-    <w:p>
-      <w:pPr>
-        <w:pStyle w:val="InfoBlue"/>
-        <w:rPr>
-          <w:i w:val="false"/>
-        </w:rPr>
-      </w:pPr>
-      <w:r>
-        <w:rPr/>
-        <w:t>[Create the interaction diagrams (2 sequence) for 2 relevant scenarios]</w:t>
-      </w:r>
+      <w:bookmarkStart w:id="61" w:name="_Toc193372775"/>
+      <w:r>
+        <w:rPr>
+          <w:lang w:val="en-US"/>
+        </w:rPr>
+        <w:t>Conclusion</w:t>
+      </w:r>
+      <w:bookmarkEnd w:id="61"/>
     </w:p>
     <w:p>
       <w:pPr>
@@ -4099,206 +4245,19 @@
     </w:p>
     <w:p>
       <w:pPr>
-        <w:pStyle w:val="Heading3"/>
-        <w:rPr>
-          <w:lang w:val="en-US"/>
-        </w:rPr>
-      </w:pPr>
-      <w:bookmarkStart w:id="58" w:name="_Toc193372771"/>
-      <w:r>
-        <w:rPr>
-          <w:lang w:val="en-US"/>
-        </w:rPr>
-        <w:t>Class Diagram</w:t>
-      </w:r>
-      <w:bookmarkEnd w:id="58"/>
-    </w:p>
-    <w:p>
-      <w:pPr>
-        <w:pStyle w:val="InfoBlue"/>
-        <w:rPr>
-          <w:i w:val="false"/>
-        </w:rPr>
-      </w:pPr>
-      <w:r>
-        <w:rPr/>
-        <w:t>[Create the UML class diagram; apply GoF patterns and motivate your choice]</w:t>
-      </w:r>
-    </w:p>
-    <w:p>
-      <w:pPr>
-        <w:pStyle w:val="Normal"/>
-        <w:rPr>
-          <w:lang w:val="en-US"/>
-        </w:rPr>
-      </w:pPr>
-      <w:r>
-        <w:rPr>
-          <w:lang w:val="en-US"/>
-        </w:rPr>
-      </w:r>
-    </w:p>
-    <w:p>
-      <w:pPr>
-        <w:pStyle w:val="Heading2"/>
-        <w:rPr>
-          <w:lang w:val="en-US"/>
-        </w:rPr>
-      </w:pPr>
-      <w:bookmarkStart w:id="59" w:name="_Toc193372772"/>
-      <w:r>
-        <w:rPr>
-          <w:lang w:val="en-US"/>
-        </w:rPr>
-        <w:t>Data Model</w:t>
-      </w:r>
-      <w:bookmarkEnd w:id="59"/>
-    </w:p>
-    <w:p>
-      <w:pPr>
-        <w:pStyle w:val="InfoBlue"/>
-        <w:rPr/>
-      </w:pPr>
-      <w:r>
-        <w:rPr/>
-        <w:t>[Create the data model for the system.]</w:t>
-      </w:r>
-    </w:p>
-    <w:p>
-      <w:pPr>
-        <w:pStyle w:val="BodyText"/>
-        <w:rPr>
-          <w:lang w:val="en-US"/>
-        </w:rPr>
-      </w:pPr>
-      <w:r>
-        <w:rPr>
-          <w:lang w:val="en-US"/>
-        </w:rPr>
-      </w:r>
-    </w:p>
-    <w:p>
-      <w:pPr>
         <w:pStyle w:val="Heading1"/>
         <w:rPr>
           <w:lang w:val="en-US"/>
         </w:rPr>
       </w:pPr>
-      <w:bookmarkStart w:id="60" w:name="_Toc193372773"/>
-      <w:r>
-        <w:rPr>
-          <w:lang w:val="en-US"/>
-        </w:rPr>
-        <w:t>System Testing</w:t>
-      </w:r>
-      <w:bookmarkEnd w:id="60"/>
-    </w:p>
-    <w:p>
-      <w:pPr>
-        <w:pStyle w:val="InfoBlue"/>
-        <w:rPr/>
-      </w:pPr>
-      <w:r>
-        <w:rPr/>
-        <w:t>[Describe the testing methides and some test cases.]</w:t>
-      </w:r>
-    </w:p>
-    <w:p>
-      <w:pPr>
-        <w:pStyle w:val="Normal"/>
-        <w:rPr>
-          <w:lang w:val="en-US"/>
-        </w:rPr>
-      </w:pPr>
-      <w:r>
-        <w:rPr>
-          <w:lang w:val="en-US"/>
-        </w:rPr>
-      </w:r>
-    </w:p>
-    <w:p>
-      <w:pPr>
-        <w:pStyle w:val="Heading1"/>
-        <w:rPr>
-          <w:lang w:val="en-US"/>
-        </w:rPr>
-      </w:pPr>
-      <w:bookmarkStart w:id="61" w:name="_Toc193372774"/>
-      <w:r>
-        <w:rPr>
-          <w:lang w:val="en-US"/>
-        </w:rPr>
-        <w:t>Future Improvements</w:t>
-      </w:r>
-      <w:bookmarkEnd w:id="61"/>
-    </w:p>
-    <w:p>
-      <w:pPr>
-        <w:pStyle w:val="InfoBlue"/>
-        <w:rPr/>
-      </w:pPr>
-      <w:r>
-        <w:rPr/>
-        <w:t>[Present some features that apply to the application scope.]</w:t>
-      </w:r>
-    </w:p>
-    <w:p>
-      <w:pPr>
-        <w:pStyle w:val="Normal"/>
-        <w:rPr>
-          <w:lang w:val="en-US"/>
-        </w:rPr>
-      </w:pPr>
-      <w:r>
-        <w:rPr>
-          <w:lang w:val="en-US"/>
-        </w:rPr>
-      </w:r>
-    </w:p>
-    <w:p>
-      <w:pPr>
-        <w:pStyle w:val="Heading1"/>
-        <w:rPr>
-          <w:lang w:val="en-US"/>
-        </w:rPr>
-      </w:pPr>
-      <w:bookmarkStart w:id="62" w:name="_Toc193372775"/>
-      <w:r>
-        <w:rPr>
-          <w:lang w:val="en-US"/>
-        </w:rPr>
-        <w:t>Conclusion</w:t>
+      <w:bookmarkStart w:id="62" w:name="_Toc193372776"/>
+      <w:r>
+        <w:rPr>
+          <w:lang w:val="en-US"/>
+        </w:rPr>
+        <w:t>Bibliography</w:t>
       </w:r>
       <w:bookmarkEnd w:id="62"/>
-    </w:p>
-    <w:p>
-      <w:pPr>
-        <w:pStyle w:val="Normal"/>
-        <w:rPr>
-          <w:lang w:val="en-US"/>
-        </w:rPr>
-      </w:pPr>
-      <w:r>
-        <w:rPr>
-          <w:lang w:val="en-US"/>
-        </w:rPr>
-      </w:r>
-    </w:p>
-    <w:p>
-      <w:pPr>
-        <w:pStyle w:val="Heading1"/>
-        <w:rPr>
-          <w:lang w:val="en-US"/>
-        </w:rPr>
-      </w:pPr>
-      <w:bookmarkStart w:id="63" w:name="_Toc193372776"/>
-      <w:r>
-        <w:rPr>
-          <w:lang w:val="en-US"/>
-        </w:rPr>
-        <w:t>Bibliography</w:t>
-      </w:r>
-      <w:bookmarkEnd w:id="63"/>
     </w:p>
     <w:p>
       <w:pPr>
@@ -4401,30 +4360,35 @@
                               <w:r>
                                 <w:rPr>
                                   <w:rStyle w:val="PageNumber"/>
+                                  <w:color w:val="000000"/>
                                 </w:rPr>
                                 <w:fldChar w:fldCharType="begin"/>
                               </w:r>
                               <w:r>
                                 <w:rPr>
                                   <w:rStyle w:val="PageNumber"/>
+                                  <w:color w:val="000000"/>
                                 </w:rPr>
                                 <w:instrText xml:space="preserve"> PAGE </w:instrText>
                               </w:r>
                               <w:r>
                                 <w:rPr>
                                   <w:rStyle w:val="PageNumber"/>
+                                  <w:color w:val="000000"/>
                                 </w:rPr>
                                 <w:fldChar w:fldCharType="separate"/>
                               </w:r>
                               <w:r>
                                 <w:rPr>
                                   <w:rStyle w:val="PageNumber"/>
+                                  <w:color w:val="000000"/>
                                 </w:rPr>
                                 <w:t>0</w:t>
                               </w:r>
                               <w:r>
                                 <w:rPr>
                                   <w:rStyle w:val="PageNumber"/>
+                                  <w:color w:val="000000"/>
                                 </w:rPr>
                                 <w:fldChar w:fldCharType="end"/>
                               </w:r>
@@ -4444,8 +4408,8 @@
         </mc:Choice>
         <mc:Fallback>
           <w:pict>
-            <v:rect id="shape_0" fillcolor="white" stroked="f" o:allowincell="f" style="position:absolute;margin-left:0pt;margin-top:0.05pt;width:1.1pt;height:1.1pt;mso-wrap-style:square;v-text-anchor:top;mso-position-horizontal-relative:margin">
-              <v:fill o:detectmouseclick="t" type="solid" color2="black" opacity="0"/>
+            <v:rect id="shape_0" stroked="f" o:allowincell="f" style="position:absolute;margin-left:0pt;margin-top:0.05pt;width:1.1pt;height:1.1pt;mso-wrap-style:square;v-text-anchor:top;mso-position-horizontal-relative:margin">
+              <v:fill o:detectmouseclick="t" on="false"/>
               <v:stroke color="#3465a4" joinstyle="round" endcap="flat"/>
               <v:textbox>
                 <w:txbxContent>
@@ -4468,30 +4432,35 @@
                         <w:r>
                           <w:rPr>
                             <w:rStyle w:val="PageNumber"/>
+                            <w:color w:val="000000"/>
                           </w:rPr>
                           <w:fldChar w:fldCharType="begin"/>
                         </w:r>
                         <w:r>
                           <w:rPr>
                             <w:rStyle w:val="PageNumber"/>
+                            <w:color w:val="000000"/>
                           </w:rPr>
                           <w:instrText xml:space="preserve"> PAGE </w:instrText>
                         </w:r>
                         <w:r>
                           <w:rPr>
                             <w:rStyle w:val="PageNumber"/>
+                            <w:color w:val="000000"/>
                           </w:rPr>
                           <w:fldChar w:fldCharType="separate"/>
                         </w:r>
                         <w:r>
                           <w:rPr>
                             <w:rStyle w:val="PageNumber"/>
+                            <w:color w:val="000000"/>
                           </w:rPr>
                           <w:t>0</w:t>
                         </w:r>
                         <w:r>
                           <w:rPr>
                             <w:rStyle w:val="PageNumber"/>
+                            <w:color w:val="000000"/>
                           </w:rPr>
                           <w:fldChar w:fldCharType="end"/>
                         </w:r>

</xml_diff>

<commit_message>
added issue rating system
</commit_message>
<xml_diff>
--- a/Deliverable.docx
+++ b/Deliverable.docx
@@ -5136,7 +5136,52 @@
       </w:pPr>
       <w:r>
         <w:rPr/>
-        <w:t>[Create the interaction diagrams (2 sequence) for 2 relevant scenarios]</w:t>
+        <w:drawing>
+          <wp:anchor distT="0" distB="0" distL="0" distR="0" simplePos="0" relativeHeight="8" behindDoc="0" locked="0" layoutInCell="0" allowOverlap="1">
+            <wp:simplePos x="0" y="0"/>
+            <wp:positionH relativeFrom="column">
+              <wp:align>center</wp:align>
+            </wp:positionH>
+            <wp:positionV relativeFrom="paragraph">
+              <wp:posOffset>635</wp:posOffset>
+            </wp:positionV>
+            <wp:extent cx="5274310" cy="3126740"/>
+            <wp:effectExtent l="0" t="0" r="0" b="0"/>
+            <wp:wrapSquare wrapText="largest"/>
+            <wp:docPr id="6" name="Image5"/>
+            <wp:cNvGraphicFramePr>
+              <a:graphicFrameLocks xmlns:a="http://schemas.openxmlformats.org/drawingml/2006/main" noChangeAspect="1"/>
+            </wp:cNvGraphicFramePr>
+            <a:graphic xmlns:a="http://schemas.openxmlformats.org/drawingml/2006/main">
+              <a:graphicData uri="http://schemas.openxmlformats.org/drawingml/2006/picture">
+                <pic:pic xmlns:pic="http://schemas.openxmlformats.org/drawingml/2006/picture">
+                  <pic:nvPicPr>
+                    <pic:cNvPr id="6" name="Image5"/>
+                    <pic:cNvPicPr>
+                      <a:picLocks noChangeAspect="1" noChangeArrowheads="1"/>
+                    </pic:cNvPicPr>
+                  </pic:nvPicPr>
+                  <pic:blipFill>
+                    <a:blip r:embed="rId7"/>
+                    <a:stretch>
+                      <a:fillRect/>
+                    </a:stretch>
+                  </pic:blipFill>
+                  <pic:spPr bwMode="auto">
+                    <a:xfrm>
+                      <a:off x="0" y="0"/>
+                      <a:ext cx="5274310" cy="3126740"/>
+                    </a:xfrm>
+                    <a:prstGeom prst="rect">
+                      <a:avLst/>
+                    </a:prstGeom>
+                    <a:noFill/>
+                  </pic:spPr>
+                </pic:pic>
+              </a:graphicData>
+            </a:graphic>
+          </wp:anchor>
+        </w:drawing>
       </w:r>
     </w:p>
     <w:p>
@@ -5150,6 +5195,65 @@
         <w:rPr>
           <w:lang w:val="en-US"/>
         </w:rPr>
+        <w:drawing>
+          <wp:anchor distT="0" distB="0" distL="0" distR="0" simplePos="0" relativeHeight="9" behindDoc="0" locked="0" layoutInCell="0" allowOverlap="1">
+            <wp:simplePos x="0" y="0"/>
+            <wp:positionH relativeFrom="column">
+              <wp:align>center</wp:align>
+            </wp:positionH>
+            <wp:positionV relativeFrom="paragraph">
+              <wp:posOffset>635</wp:posOffset>
+            </wp:positionV>
+            <wp:extent cx="5731510" cy="2555875"/>
+            <wp:effectExtent l="0" t="0" r="0" b="0"/>
+            <wp:wrapSquare wrapText="largest"/>
+            <wp:docPr id="7" name="Image6"/>
+            <wp:cNvGraphicFramePr>
+              <a:graphicFrameLocks xmlns:a="http://schemas.openxmlformats.org/drawingml/2006/main" noChangeAspect="1"/>
+            </wp:cNvGraphicFramePr>
+            <a:graphic xmlns:a="http://schemas.openxmlformats.org/drawingml/2006/main">
+              <a:graphicData uri="http://schemas.openxmlformats.org/drawingml/2006/picture">
+                <pic:pic xmlns:pic="http://schemas.openxmlformats.org/drawingml/2006/picture">
+                  <pic:nvPicPr>
+                    <pic:cNvPr id="7" name="Image6"/>
+                    <pic:cNvPicPr>
+                      <a:picLocks noChangeAspect="1" noChangeArrowheads="1"/>
+                    </pic:cNvPicPr>
+                  </pic:nvPicPr>
+                  <pic:blipFill>
+                    <a:blip r:embed="rId8"/>
+                    <a:stretch>
+                      <a:fillRect/>
+                    </a:stretch>
+                  </pic:blipFill>
+                  <pic:spPr bwMode="auto">
+                    <a:xfrm>
+                      <a:off x="0" y="0"/>
+                      <a:ext cx="5731510" cy="2555875"/>
+                    </a:xfrm>
+                    <a:prstGeom prst="rect">
+                      <a:avLst/>
+                    </a:prstGeom>
+                    <a:noFill/>
+                  </pic:spPr>
+                </pic:pic>
+              </a:graphicData>
+            </a:graphic>
+          </wp:anchor>
+        </w:drawing>
+      </w:r>
+    </w:p>
+    <w:p>
+      <w:pPr>
+        <w:pStyle w:val="Normal"/>
+        <w:rPr>
+          <w:lang w:val="en-US"/>
+        </w:rPr>
+      </w:pPr>
+      <w:r>
+        <w:rPr>
+          <w:lang w:val="en-US"/>
+        </w:rPr>
       </w:r>
     </w:p>
     <w:p>
@@ -5179,6 +5283,12 @@
         <w:rPr/>
         <w:t>[Create the UML class diagram; apply GoF patterns and motivate your choice]</w:t>
       </w:r>
+      <w:r>
+        <w:rPr>
+          <w:i w:val="false"/>
+        </w:rPr>
+        <w:tab/>
+      </w:r>
     </w:p>
     <w:p>
       <w:pPr>
@@ -5369,12 +5479,12 @@
       </w:r>
     </w:p>
     <w:sectPr>
-      <w:headerReference w:type="even" r:id="rId7"/>
-      <w:headerReference w:type="default" r:id="rId8"/>
-      <w:headerReference w:type="first" r:id="rId9"/>
-      <w:footerReference w:type="even" r:id="rId10"/>
-      <w:footerReference w:type="default" r:id="rId11"/>
-      <w:footerReference w:type="first" r:id="rId12"/>
+      <w:headerReference w:type="even" r:id="rId9"/>
+      <w:headerReference w:type="default" r:id="rId10"/>
+      <w:headerReference w:type="first" r:id="rId11"/>
+      <w:footerReference w:type="even" r:id="rId12"/>
+      <w:footerReference w:type="default" r:id="rId13"/>
+      <w:footerReference w:type="first" r:id="rId14"/>
       <w:type w:val="nextPage"/>
       <w:pgSz w:w="11906" w:h="16838"/>
       <w:pgMar w:left="1440" w:right="1440" w:gutter="0" w:header="708" w:top="1440" w:footer="708" w:bottom="1440"/>
@@ -5411,7 +5521,7 @@
               <wp:extent cx="14605" cy="14605"/>
               <wp:effectExtent l="0" t="0" r="0" b="0"/>
               <wp:wrapNone/>
-              <wp:docPr id="6" name="Frame1"/>
+              <wp:docPr id="8" name="Frame1"/>
               <a:graphic xmlns:a="http://schemas.openxmlformats.org/drawingml/2006/main">
                 <a:graphicData uri="http://schemas.microsoft.com/office/word/2010/wordprocessingShape">
                   <wps:wsp>
@@ -8863,7 +8973,6 @@
     <w:lvl w:ilvl="3">
       <w:start w:val="1"/>
       <w:numFmt w:val="none"/>
-      <w:pStyle w:val="Heading4"/>
       <w:suff w:val="nothing"/>
       <w:lvlText w:val=""/>
       <w:lvlJc w:val="start"/>
@@ -9615,8 +9724,8 @@
     <w:qFormat/>
     <w:rPr/>
   </w:style>
-  <w:style w:type="character" w:styleId="Bulletsuser">
-    <w:name w:val="Bullets (user)"/>
+  <w:style w:type="character" w:styleId="Bullets">
+    <w:name w:val="Bullets"/>
     <w:qFormat/>
     <w:rPr>
       <w:rFonts w:ascii="OpenSymbol" w:hAnsi="OpenSymbol" w:eastAsia="OpenSymbol" w:cs="OpenSymbol"/>
@@ -9629,8 +9738,8 @@
       <w:rFonts w:ascii="DejaVu Sans Mono" w:hAnsi="DejaVu Sans Mono" w:eastAsia="DejaVu Sans Mono" w:cs="DejaVu Sans Mono"/>
     </w:rPr>
   </w:style>
-  <w:style w:type="character" w:styleId="Bullets">
-    <w:name w:val="Bullets"/>
+  <w:style w:type="character" w:styleId="Bulletsuser">
+    <w:name w:val="Bullets (user)"/>
     <w:qFormat/>
     <w:rPr>
       <w:rFonts w:ascii="OpenSymbol" w:hAnsi="OpenSymbol" w:eastAsia="OpenSymbol" w:cs="OpenSymbol"/>
@@ -9949,15 +10058,15 @@
       <w:lang w:val="en-US"/>
     </w:rPr>
   </w:style>
-  <w:style w:type="paragraph" w:styleId="FrameContentsuser">
-    <w:name w:val="Frame Contents (user)"/>
+  <w:style w:type="paragraph" w:styleId="FrameContents">
+    <w:name w:val="Frame Contents"/>
     <w:basedOn w:val="Normal"/>
     <w:qFormat/>
     <w:pPr/>
     <w:rPr/>
   </w:style>
-  <w:style w:type="paragraph" w:styleId="FrameContents">
-    <w:name w:val="Frame Contents"/>
+  <w:style w:type="paragraph" w:styleId="FrameContentsuser">
+    <w:name w:val="Frame Contents (user)"/>
     <w:basedOn w:val="Normal"/>
     <w:qFormat/>
     <w:pPr/>

</xml_diff>